<commit_message>
Correccion 09 - Llegue OK hasta Vernengo Hipolito
</commit_message>
<xml_diff>
--- a/Practicos/Notas y Devoluciones 09.docx
+++ b/Practicos/Notas y Devoluciones 09.docx
@@ -838,7 +838,7 @@
       </w:r>
       <w:proofErr w:type="gramEnd"/>
       <w:r>
-        <w:t xml:space="preserve">Felicitaciones por la entrega del Desafío 08! </w:t>
+        <w:t xml:space="preserve">Felicitaciones por la entrega del Desafío 09! </w:t>
       </w:r>
       <w:r>
         <w:rPr>
@@ -849,82 +849,52 @@
     </w:p>
     <w:p/>
     <w:p>
-      <w:r>
-        <w:t>Belen, excelente trabajo, te felicito por el compromiso en realizar las entregas.</w:t>
-      </w:r>
-    </w:p>
-    <w:p/>
-    <w:p>
-      <w:r>
-        <w:t xml:space="preserve">Excelente el resultado logrado, </w:t>
-      </w:r>
-      <w:r>
-        <w:tab/>
-        <w:t xml:space="preserve">la selección de elementos del DOM y la manipulación de su contenido es correcto. También manipulaste correctamente clases y atributos con </w:t>
-      </w:r>
-      <w:proofErr w:type="spellStart"/>
-      <w:r>
-        <w:t>Dataset</w:t>
-      </w:r>
-      <w:proofErr w:type="spellEnd"/>
-      <w:r>
-        <w:t>.</w:t>
-      </w:r>
-    </w:p>
-    <w:p>
-      <w:r>
-        <w:t xml:space="preserve"> </w:t>
-      </w:r>
-    </w:p>
+      <w:proofErr w:type="spellStart"/>
+      <w:r>
+        <w:t>Belen</w:t>
+      </w:r>
+      <w:proofErr w:type="spellEnd"/>
+      <w:r>
+        <w:t>, excelente trabajo, el resultado es el solicitado.</w:t>
+      </w:r>
+    </w:p>
+    <w:p/>
+    <w:p>
+      <w:r>
+        <w:t xml:space="preserve">La aplicación En </w:t>
+      </w:r>
+      <w:proofErr w:type="spellStart"/>
+      <w:r>
+        <w:t>React</w:t>
+      </w:r>
+      <w:proofErr w:type="spellEnd"/>
+      <w:r>
+        <w:t xml:space="preserve"> Vite es tal cual se solicitó en enunciado.</w:t>
+      </w:r>
+    </w:p>
+    <w:p/>
     <w:p>
       <w:pPr>
         <w:rPr>
           <w:u w:val="single"/>
         </w:rPr>
       </w:pPr>
-      <w:proofErr w:type="spellStart"/>
-      <w:r>
-        <w:t>Buenisimo</w:t>
-      </w:r>
-      <w:proofErr w:type="spellEnd"/>
-      <w:r>
-        <w:t xml:space="preserve"> que aplicaste eventos con </w:t>
-      </w:r>
-      <w:proofErr w:type="spellStart"/>
-      <w:r>
-        <w:t>addEventListener</w:t>
-      </w:r>
-      <w:proofErr w:type="spellEnd"/>
-      <w:r>
-        <w:t xml:space="preserve">, correcta la aplicación </w:t>
-      </w:r>
-      <w:proofErr w:type="spellStart"/>
-      <w:r>
-        <w:t>Event</w:t>
-      </w:r>
-      <w:proofErr w:type="spellEnd"/>
-      <w:r>
-        <w:t xml:space="preserve"> </w:t>
-      </w:r>
-      <w:proofErr w:type="spellStart"/>
-      <w:r>
-        <w:t>Delegation</w:t>
-      </w:r>
-      <w:proofErr w:type="spellEnd"/>
-      <w:r>
-        <w:t>.</w:t>
-      </w:r>
-    </w:p>
-    <w:p/>
-    <w:p>
-      <w:r>
-        <w:t>Destaco que para evitar la repetición de código te manejaste correctamente con funciones con retorno y también de alto orden.</w:t>
-      </w:r>
-    </w:p>
-    <w:p/>
-    <w:p>
-      <w:r>
-        <w:t>Quiero destacar la prolijidad de tu código.</w:t>
+      <w:r>
+        <w:t xml:space="preserve">La estructura del proyecto esta ok, los componentes trabajan correctamente con </w:t>
+      </w:r>
+      <w:proofErr w:type="spellStart"/>
+      <w:r>
+        <w:t>props</w:t>
+      </w:r>
+      <w:proofErr w:type="spellEnd"/>
+      <w:r>
+        <w:t xml:space="preserve"> y el proyecto levanta la lista de contactos del array indicado.</w:t>
+      </w:r>
+    </w:p>
+    <w:p/>
+    <w:p>
+      <w:r>
+        <w:t>Quiero destacar la prolijidad de tu código y el trabajo aplicado en los estilos personalizados, quedo genial.</w:t>
       </w:r>
     </w:p>
     <w:p/>
@@ -937,7 +907,7 @@
     <w:p/>
     <w:p>
       <w:r>
-        <w:t xml:space="preserve">Tu nota en el Desafío 08 es: </w:t>
+        <w:t xml:space="preserve">Tu nota en el Desafío 09 es: </w:t>
       </w:r>
       <w:r>
         <w:rPr>
@@ -1096,7 +1066,6 @@
     <w:p/>
     <w:p>
       <w:r>
-        <w:lastRenderedPageBreak/>
         <w:t>Para evitar la repetición de código te manejaste correctamente con funciones con retorno y también de alto orden.</w:t>
       </w:r>
     </w:p>
@@ -1211,7 +1180,7 @@
       </w:r>
       <w:proofErr w:type="gramEnd"/>
       <w:r>
-        <w:t xml:space="preserve">Felicitaciones por la entrega del Desafío 08! </w:t>
+        <w:t xml:space="preserve">Felicitaciones por la entrega del Desafío 09! </w:t>
       </w:r>
       <w:r>
         <w:rPr>
@@ -1223,81 +1192,49 @@
     <w:p/>
     <w:p>
       <w:r>
-        <w:t>Carlos, excelente trabajo, te felicito por el compromiso en realizar las entregas.</w:t>
-      </w:r>
-    </w:p>
-    <w:p/>
-    <w:p>
-      <w:r>
-        <w:t xml:space="preserve">Excelente el resultado logrado, </w:t>
-      </w:r>
-      <w:r>
-        <w:tab/>
-        <w:t xml:space="preserve">la selección de elementos del DOM y la manipulación de su contenido es correcto. También manipulaste correctamente clases y atributos con </w:t>
-      </w:r>
-      <w:proofErr w:type="spellStart"/>
-      <w:r>
-        <w:t>Dataset</w:t>
-      </w:r>
-      <w:proofErr w:type="spellEnd"/>
-      <w:r>
-        <w:t>.</w:t>
-      </w:r>
-    </w:p>
-    <w:p>
-      <w:r>
-        <w:t xml:space="preserve"> </w:t>
-      </w:r>
-    </w:p>
+        <w:t>Carlos</w:t>
+      </w:r>
+      <w:r>
+        <w:t>, excelente trabajo, el resultado es el solicitado.</w:t>
+      </w:r>
+    </w:p>
+    <w:p/>
+    <w:p>
+      <w:r>
+        <w:t xml:space="preserve">La aplicación En </w:t>
+      </w:r>
+      <w:proofErr w:type="spellStart"/>
+      <w:r>
+        <w:t>React</w:t>
+      </w:r>
+      <w:proofErr w:type="spellEnd"/>
+      <w:r>
+        <w:t xml:space="preserve"> Vite es tal cual se solicitó en enunciado.</w:t>
+      </w:r>
+    </w:p>
+    <w:p/>
     <w:p>
       <w:pPr>
         <w:rPr>
           <w:u w:val="single"/>
         </w:rPr>
       </w:pPr>
-      <w:proofErr w:type="spellStart"/>
-      <w:r>
-        <w:t>Buenisimo</w:t>
-      </w:r>
-      <w:proofErr w:type="spellEnd"/>
-      <w:r>
-        <w:t xml:space="preserve"> que aplicaste eventos con </w:t>
-      </w:r>
-      <w:proofErr w:type="spellStart"/>
-      <w:r>
-        <w:t>addEventListener</w:t>
-      </w:r>
-      <w:proofErr w:type="spellEnd"/>
-      <w:r>
-        <w:t xml:space="preserve">, correcta la aplicación </w:t>
-      </w:r>
-      <w:proofErr w:type="spellStart"/>
-      <w:r>
-        <w:t>Event</w:t>
-      </w:r>
-      <w:proofErr w:type="spellEnd"/>
-      <w:r>
-        <w:t xml:space="preserve"> </w:t>
-      </w:r>
-      <w:proofErr w:type="spellStart"/>
-      <w:r>
-        <w:t>Delegation</w:t>
-      </w:r>
-      <w:proofErr w:type="spellEnd"/>
-      <w:r>
-        <w:t>.</w:t>
-      </w:r>
-    </w:p>
-    <w:p/>
-    <w:p>
-      <w:r>
-        <w:t>Destaco que para evitar la repetición de código te manejaste correctamente con funciones con retorno y también de alto orden.</w:t>
-      </w:r>
-    </w:p>
-    <w:p/>
-    <w:p>
-      <w:r>
-        <w:t>Quiero destacar la prolijidad de tu código.</w:t>
+      <w:r>
+        <w:t xml:space="preserve">La estructura del proyecto esta ok, los componentes trabajan correctamente con </w:t>
+      </w:r>
+      <w:proofErr w:type="spellStart"/>
+      <w:r>
+        <w:t>props</w:t>
+      </w:r>
+      <w:proofErr w:type="spellEnd"/>
+      <w:r>
+        <w:t xml:space="preserve"> y el proyecto levanta la lista de contactos del array indicado.</w:t>
+      </w:r>
+    </w:p>
+    <w:p/>
+    <w:p>
+      <w:r>
+        <w:t>Quiero destacar la prolijidad de tu código y el trabajo aplicado en los estilos personalizados, quedo genial.</w:t>
       </w:r>
     </w:p>
     <w:p/>
@@ -1310,7 +1247,8 @@
     <w:p/>
     <w:p>
       <w:r>
-        <w:t xml:space="preserve">Tu nota en el Desafío 08 es: </w:t>
+        <w:lastRenderedPageBreak/>
+        <w:t xml:space="preserve">Tu nota en el Desafío 09 es: </w:t>
       </w:r>
       <w:r>
         <w:rPr>
@@ -1383,7 +1321,7 @@
       </w:r>
       <w:proofErr w:type="gramEnd"/>
       <w:r>
-        <w:t xml:space="preserve">Felicitaciones por la entrega del Desafío 08! </w:t>
+        <w:t xml:space="preserve">Felicitaciones por la entrega del Desafío 09! </w:t>
       </w:r>
       <w:r>
         <w:rPr>
@@ -1395,81 +1333,49 @@
     <w:p/>
     <w:p>
       <w:r>
-        <w:t>Gianluca, excelente trabajo, te felicito por el compromiso en realizar las entregas.</w:t>
-      </w:r>
-    </w:p>
-    <w:p/>
-    <w:p>
-      <w:r>
-        <w:t xml:space="preserve">Excelente el resultado logrado, </w:t>
-      </w:r>
-      <w:r>
-        <w:tab/>
-        <w:t xml:space="preserve">la selección de elementos del DOM y la manipulación de su contenido es correcto. También manipulaste correctamente clases y atributos con </w:t>
-      </w:r>
-      <w:proofErr w:type="spellStart"/>
-      <w:r>
-        <w:t>Dataset</w:t>
-      </w:r>
-      <w:proofErr w:type="spellEnd"/>
-      <w:r>
-        <w:t>.</w:t>
-      </w:r>
-    </w:p>
-    <w:p>
-      <w:r>
-        <w:t xml:space="preserve"> </w:t>
-      </w:r>
-    </w:p>
+        <w:t>Gianluca</w:t>
+      </w:r>
+      <w:r>
+        <w:t>, excelente trabajo,</w:t>
+      </w:r>
+    </w:p>
+    <w:p/>
+    <w:p>
+      <w:r>
+        <w:t xml:space="preserve">La aplicación En </w:t>
+      </w:r>
+      <w:proofErr w:type="spellStart"/>
+      <w:r>
+        <w:t>React</w:t>
+      </w:r>
+      <w:proofErr w:type="spellEnd"/>
+      <w:r>
+        <w:t xml:space="preserve"> Vite es tal cual se solicitó en enunciado.</w:t>
+      </w:r>
+    </w:p>
+    <w:p/>
     <w:p>
       <w:pPr>
         <w:rPr>
           <w:u w:val="single"/>
         </w:rPr>
       </w:pPr>
-      <w:proofErr w:type="spellStart"/>
-      <w:r>
-        <w:t>Buenisimo</w:t>
-      </w:r>
-      <w:proofErr w:type="spellEnd"/>
-      <w:r>
-        <w:t xml:space="preserve"> que aplicaste eventos con </w:t>
-      </w:r>
-      <w:proofErr w:type="spellStart"/>
-      <w:r>
-        <w:t>addEventListener</w:t>
-      </w:r>
-      <w:proofErr w:type="spellEnd"/>
-      <w:r>
-        <w:t xml:space="preserve">, correcta la aplicación </w:t>
-      </w:r>
-      <w:proofErr w:type="spellStart"/>
-      <w:r>
-        <w:t>Event</w:t>
-      </w:r>
-      <w:proofErr w:type="spellEnd"/>
-      <w:r>
-        <w:t xml:space="preserve"> </w:t>
-      </w:r>
-      <w:proofErr w:type="spellStart"/>
-      <w:r>
-        <w:t>Delegation</w:t>
-      </w:r>
-      <w:proofErr w:type="spellEnd"/>
-      <w:r>
-        <w:t>.</w:t>
-      </w:r>
-    </w:p>
-    <w:p/>
-    <w:p>
-      <w:r>
-        <w:t>Destaco que para evitar la repetición de código te manejaste correctamente con funciones con retorno y también de alto orden.</w:t>
-      </w:r>
-    </w:p>
-    <w:p/>
-    <w:p>
-      <w:r>
-        <w:t>Quiero destacar la prolijidad de tu código.</w:t>
+      <w:r>
+        <w:t xml:space="preserve">La estructura del proyecto esta ok, los componentes trabajan correctamente con </w:t>
+      </w:r>
+      <w:proofErr w:type="spellStart"/>
+      <w:r>
+        <w:t>props</w:t>
+      </w:r>
+      <w:proofErr w:type="spellEnd"/>
+      <w:r>
+        <w:t xml:space="preserve"> y el proyecto levanta la lista de contactos del array indicado.</w:t>
+      </w:r>
+    </w:p>
+    <w:p/>
+    <w:p>
+      <w:r>
+        <w:t>Quiero destacar la prolijidad de tu código y los estilos aplicados con Bootstrap quedaron genial.</w:t>
       </w:r>
     </w:p>
     <w:p/>
@@ -1482,7 +1388,7 @@
     <w:p/>
     <w:p>
       <w:r>
-        <w:t xml:space="preserve">Tu nota en el Desafío 08 es: </w:t>
+        <w:t xml:space="preserve">Tu nota en el Desafío 09 es: </w:t>
       </w:r>
       <w:r>
         <w:rPr>
@@ -1575,10 +1481,7 @@
     <w:p/>
     <w:p>
       <w:r>
-        <w:t>Santino</w:t>
-      </w:r>
-      <w:r>
-        <w:t>, excelente trabajo,</w:t>
+        <w:t>Santino, excelente trabajo,</w:t>
       </w:r>
     </w:p>
     <w:p/>
@@ -1696,7 +1599,7 @@
       </w:r>
       <w:proofErr w:type="gramEnd"/>
       <w:r>
-        <w:t xml:space="preserve">Felicitaciones por la entrega del Desafío 08! </w:t>
+        <w:t xml:space="preserve">Felicitaciones por la entrega del Desafío 09! </w:t>
       </w:r>
       <w:r>
         <w:rPr>
@@ -1713,373 +1616,67 @@
       </w:r>
       <w:proofErr w:type="spellEnd"/>
       <w:r>
-        <w:t>, muy buen trabajo, te felicito por el compromiso en realizar las entregas.</w:t>
-      </w:r>
-    </w:p>
+        <w:t>, excelente trabajo, el resultado es el solicitado.</w:t>
+      </w:r>
+    </w:p>
+    <w:p/>
+    <w:p>
+      <w:r>
+        <w:t xml:space="preserve">La aplicación En </w:t>
+      </w:r>
+      <w:proofErr w:type="spellStart"/>
+      <w:r>
+        <w:t>React</w:t>
+      </w:r>
+      <w:proofErr w:type="spellEnd"/>
+      <w:r>
+        <w:t xml:space="preserve"> Vite es tal cual se solicitó en enunciado.</w:t>
+      </w:r>
+    </w:p>
+    <w:p/>
+    <w:p>
+      <w:pPr>
+        <w:rPr>
+          <w:u w:val="single"/>
+        </w:rPr>
+      </w:pPr>
+      <w:r>
+        <w:t xml:space="preserve">La estructura del proyecto esta ok, los componentes trabajan correctamente con </w:t>
+      </w:r>
+      <w:proofErr w:type="spellStart"/>
+      <w:r>
+        <w:t>props</w:t>
+      </w:r>
+      <w:proofErr w:type="spellEnd"/>
+      <w:r>
+        <w:t xml:space="preserve"> y el proyecto levanta la lista de contactos del array indicado.</w:t>
+      </w:r>
+    </w:p>
+    <w:p/>
+    <w:p>
+      <w:r>
+        <w:t>Quiero destacar la prolijidad de tu código y el trabajo aplicado en los estilos personalizados, quedo genial.</w:t>
+      </w:r>
+    </w:p>
+    <w:p/>
     <w:p/>
     <w:p>
       <w:r>
         <w:lastRenderedPageBreak/>
-        <w:t xml:space="preserve">La selección de elementos del DOM y la manipulación de su contenido es </w:t>
-      </w:r>
-      <w:proofErr w:type="gramStart"/>
-      <w:r>
-        <w:t>correcto</w:t>
-      </w:r>
-      <w:proofErr w:type="gramEnd"/>
-      <w:r>
-        <w:t xml:space="preserve">. También manipulaste correctamente clases y atributos con </w:t>
-      </w:r>
-      <w:proofErr w:type="spellStart"/>
-      <w:r>
-        <w:t>Dataset</w:t>
-      </w:r>
-      <w:proofErr w:type="spellEnd"/>
-      <w:r>
-        <w:t>.</w:t>
-      </w:r>
-    </w:p>
-    <w:p>
-      <w:r>
-        <w:t xml:space="preserve"> </w:t>
-      </w:r>
-    </w:p>
-    <w:p/>
-    <w:p>
-      <w:r>
-        <w:t>Quiero destacar la prolijidad de tu código.</w:t>
-      </w:r>
-    </w:p>
-    <w:p/>
-    <w:p/>
-    <w:p>
-      <w:r>
-        <w:t>Observaciones a tu trabajo son:</w:t>
-      </w:r>
-    </w:p>
-    <w:p/>
-    <w:p>
-      <w:r>
-        <w:t>Ejercicio nro. 9:</w:t>
-      </w:r>
-    </w:p>
-    <w:p/>
-    <w:p>
-      <w:pPr>
-        <w:pStyle w:val="Prrafodelista"/>
-        <w:numPr>
-          <w:ilvl w:val="0"/>
-          <w:numId w:val="9"/>
-        </w:numPr>
-      </w:pPr>
-      <w:r>
-        <w:t>Falto agregar botón de Eliminar en la renderización inicial en la línea 68:</w:t>
-      </w:r>
-    </w:p>
-    <w:p>
-      <w:pPr>
-        <w:pStyle w:val="Prrafodelista"/>
-        <w:numPr>
-          <w:ilvl w:val="1"/>
-          <w:numId w:val="9"/>
-        </w:numPr>
-      </w:pPr>
-      <w:r>
-        <w:t>&lt;</w:t>
-      </w:r>
-      <w:proofErr w:type="spellStart"/>
-      <w:r>
-        <w:t>button</w:t>
-      </w:r>
-      <w:proofErr w:type="spellEnd"/>
-      <w:r>
-        <w:t xml:space="preserve"> </w:t>
-      </w:r>
-      <w:proofErr w:type="spellStart"/>
-      <w:r>
-        <w:t>class</w:t>
-      </w:r>
-      <w:proofErr w:type="spellEnd"/>
-      <w:r>
-        <w:t>="</w:t>
-      </w:r>
-      <w:proofErr w:type="spellStart"/>
-      <w:r>
-        <w:t>btn</w:t>
-      </w:r>
-      <w:proofErr w:type="spellEnd"/>
-      <w:r>
-        <w:t>-eliminar" data-id="${</w:t>
-      </w:r>
-      <w:proofErr w:type="spellStart"/>
-      <w:r>
-        <w:t>contacto.id</w:t>
-      </w:r>
-      <w:proofErr w:type="spellEnd"/>
-      <w:r>
-        <w:t>}"&gt;</w:t>
-      </w:r>
-      <w:r>
-        <w:rPr>
-          <w:rFonts w:ascii="Segoe UI Symbol" w:hAnsi="Segoe UI Symbol" w:cs="Segoe UI Symbol"/>
-        </w:rPr>
-        <w:t>✕</w:t>
-      </w:r>
-      <w:r>
-        <w:t>&lt;/</w:t>
-      </w:r>
-      <w:proofErr w:type="spellStart"/>
-      <w:r>
-        <w:t>button</w:t>
-      </w:r>
-      <w:proofErr w:type="spellEnd"/>
-      <w:r>
-        <w:t>&gt;</w:t>
-      </w:r>
-    </w:p>
-    <w:p/>
-    <w:p>
-      <w:pPr>
-        <w:pStyle w:val="Prrafodelista"/>
-        <w:numPr>
-          <w:ilvl w:val="0"/>
-          <w:numId w:val="9"/>
-        </w:numPr>
-      </w:pPr>
-      <w:r>
-        <w:t>Falta lógica para eliminar contactos:</w:t>
-      </w:r>
-    </w:p>
-    <w:p>
-      <w:pPr>
-        <w:pStyle w:val="Prrafodelista"/>
-        <w:ind w:left="1440"/>
-      </w:pPr>
-      <w:proofErr w:type="spellStart"/>
-      <w:r>
-        <w:t>contactosHTML.addEventListener</w:t>
-      </w:r>
-      <w:proofErr w:type="spellEnd"/>
-      <w:r>
-        <w:t>("</w:t>
-      </w:r>
-      <w:proofErr w:type="spellStart"/>
-      <w:r>
-        <w:t>click</w:t>
-      </w:r>
-      <w:proofErr w:type="spellEnd"/>
-      <w:r>
-        <w:t>", (e) =&gt; {</w:t>
-      </w:r>
-    </w:p>
-    <w:p>
-      <w:pPr>
-        <w:pStyle w:val="Prrafodelista"/>
-        <w:ind w:left="1440"/>
-      </w:pPr>
-      <w:r>
-        <w:t xml:space="preserve">     </w:t>
-      </w:r>
-      <w:proofErr w:type="spellStart"/>
-      <w:r>
-        <w:t>const</w:t>
-      </w:r>
-      <w:proofErr w:type="spellEnd"/>
-      <w:r>
-        <w:t xml:space="preserve"> </w:t>
-      </w:r>
-      <w:proofErr w:type="spellStart"/>
-      <w:r>
-        <w:t>btnEliminar</w:t>
-      </w:r>
-      <w:proofErr w:type="spellEnd"/>
-      <w:r>
-        <w:t xml:space="preserve"> = </w:t>
-      </w:r>
-      <w:proofErr w:type="spellStart"/>
-      <w:proofErr w:type="gramStart"/>
-      <w:r>
-        <w:t>e.target</w:t>
-      </w:r>
-      <w:proofErr w:type="gramEnd"/>
-      <w:r>
-        <w:t>.closest</w:t>
-      </w:r>
-      <w:proofErr w:type="spellEnd"/>
-      <w:r>
-        <w:t>(".</w:t>
-      </w:r>
-      <w:proofErr w:type="spellStart"/>
-      <w:r>
-        <w:t>btn</w:t>
-      </w:r>
-      <w:proofErr w:type="spellEnd"/>
-      <w:r>
-        <w:t>-eliminar")</w:t>
-      </w:r>
-    </w:p>
-    <w:p>
-      <w:pPr>
-        <w:pStyle w:val="Prrafodelista"/>
-        <w:ind w:left="1440"/>
-      </w:pPr>
-      <w:r>
-        <w:t xml:space="preserve">     </w:t>
-      </w:r>
-      <w:proofErr w:type="spellStart"/>
-      <w:r>
-        <w:t>if</w:t>
-      </w:r>
-      <w:proofErr w:type="spellEnd"/>
-      <w:r>
-        <w:t xml:space="preserve"> </w:t>
-      </w:r>
-      <w:proofErr w:type="gramStart"/>
-      <w:r>
-        <w:t>(!</w:t>
-      </w:r>
-      <w:proofErr w:type="spellStart"/>
-      <w:r>
-        <w:t>btnEliminar</w:t>
-      </w:r>
-      <w:proofErr w:type="spellEnd"/>
-      <w:proofErr w:type="gramEnd"/>
-      <w:r>
-        <w:t xml:space="preserve">) </w:t>
-      </w:r>
-      <w:proofErr w:type="spellStart"/>
-      <w:r>
-        <w:t>return</w:t>
-      </w:r>
-      <w:proofErr w:type="spellEnd"/>
-      <w:r>
-        <w:t xml:space="preserve"> </w:t>
-      </w:r>
-    </w:p>
-    <w:p>
-      <w:pPr>
-        <w:pStyle w:val="Prrafodelista"/>
-        <w:ind w:left="1440"/>
-      </w:pPr>
-    </w:p>
-    <w:p>
-      <w:pPr>
-        <w:pStyle w:val="Prrafodelista"/>
-        <w:ind w:left="1440"/>
-      </w:pPr>
-      <w:r>
-        <w:t xml:space="preserve">     </w:t>
-      </w:r>
-      <w:proofErr w:type="spellStart"/>
-      <w:r>
-        <w:t>const</w:t>
-      </w:r>
-      <w:proofErr w:type="spellEnd"/>
-      <w:r>
-        <w:t xml:space="preserve"> id = </w:t>
-      </w:r>
-      <w:proofErr w:type="spellStart"/>
-      <w:r>
-        <w:t>Number</w:t>
-      </w:r>
-      <w:proofErr w:type="spellEnd"/>
-      <w:r>
-        <w:t>(</w:t>
-      </w:r>
-      <w:proofErr w:type="spellStart"/>
-      <w:r>
-        <w:t>btnEliminar.dataset.id</w:t>
-      </w:r>
-      <w:proofErr w:type="spellEnd"/>
-      <w:r>
-        <w:t>)</w:t>
-      </w:r>
-    </w:p>
-    <w:p>
-      <w:pPr>
-        <w:pStyle w:val="Prrafodelista"/>
-        <w:ind w:left="1440"/>
-      </w:pPr>
-      <w:r>
-        <w:t xml:space="preserve">     contactos = </w:t>
-      </w:r>
-      <w:proofErr w:type="spellStart"/>
-      <w:proofErr w:type="gramStart"/>
-      <w:r>
-        <w:t>contactos.filter</w:t>
-      </w:r>
-      <w:proofErr w:type="spellEnd"/>
-      <w:proofErr w:type="gramEnd"/>
-      <w:r>
-        <w:t xml:space="preserve">(contacto =&gt; </w:t>
-      </w:r>
-      <w:proofErr w:type="spellStart"/>
-      <w:r>
-        <w:t>contacto.id</w:t>
-      </w:r>
-      <w:proofErr w:type="spellEnd"/>
-      <w:r>
-        <w:t xml:space="preserve"> !== id)</w:t>
-      </w:r>
-    </w:p>
-    <w:p>
-      <w:pPr>
-        <w:pStyle w:val="Prrafodelista"/>
-        <w:ind w:left="1440"/>
-      </w:pPr>
-    </w:p>
-    <w:p>
-      <w:pPr>
-        <w:pStyle w:val="Prrafodelista"/>
-        <w:ind w:left="1440"/>
-      </w:pPr>
-      <w:r>
-        <w:t xml:space="preserve">     </w:t>
-      </w:r>
-      <w:proofErr w:type="spellStart"/>
-      <w:r>
-        <w:t>renderContactos</w:t>
-      </w:r>
-      <w:proofErr w:type="spellEnd"/>
-      <w:r>
-        <w:t>(contactos)</w:t>
-      </w:r>
-    </w:p>
-    <w:p>
-      <w:pPr>
-        <w:pStyle w:val="Prrafodelista"/>
-        <w:ind w:left="1440"/>
-      </w:pPr>
-      <w:r>
-        <w:t xml:space="preserve"> }) </w:t>
-      </w:r>
-      <w:r>
-        <w:tab/>
-      </w:r>
-    </w:p>
-    <w:p/>
-    <w:p>
-      <w:r>
-        <w:tab/>
-      </w:r>
-    </w:p>
-    <w:p/>
-    <w:p>
-      <w:r>
-        <w:t>Todo lo demás esta perfecto, muy buen trabajo ¡</w:t>
-      </w:r>
-    </w:p>
-    <w:p/>
-    <w:p>
-      <w:r>
-        <w:t xml:space="preserve">Tu nota en el Desafío 08 es: </w:t>
-      </w:r>
-      <w:r>
-        <w:rPr>
-          <w:b/>
-          <w:bCs/>
-        </w:rPr>
-        <w:t>9</w:t>
+        <w:t>Excelente trabajo ¡</w:t>
+      </w:r>
+    </w:p>
+    <w:p/>
+    <w:p>
+      <w:r>
+        <w:t xml:space="preserve">Tu nota en el Desafío 09 es: </w:t>
+      </w:r>
+      <w:r>
+        <w:rPr>
+          <w:b/>
+          <w:bCs/>
+        </w:rPr>
+        <w:t>10</w:t>
       </w:r>
     </w:p>
     <w:p>
@@ -2134,7 +1731,6 @@
         <w:rPr>
           <w:rFonts w:ascii="Segoe UI Emoji" w:hAnsi="Segoe UI Emoji" w:cs="Segoe UI Emoji"/>
         </w:rPr>
-        <w:lastRenderedPageBreak/>
         <w:t>🎉</w:t>
       </w:r>
       <w:r>
@@ -2142,7 +1738,7 @@
       </w:r>
       <w:proofErr w:type="gramEnd"/>
       <w:r>
-        <w:t xml:space="preserve">Felicitaciones por la entrega del Desafío 08! </w:t>
+        <w:t xml:space="preserve">Felicitaciones por la entrega del Desafío 09! </w:t>
       </w:r>
       <w:r>
         <w:rPr>
@@ -2154,81 +1750,61 @@
     <w:p/>
     <w:p>
       <w:r>
-        <w:t>Tomas, excelente trabajo, te felicito por el compromiso en realizar las entregas.</w:t>
-      </w:r>
-    </w:p>
-    <w:p/>
-    <w:p>
-      <w:r>
-        <w:t xml:space="preserve">Excelente el resultado logrado, </w:t>
-      </w:r>
-      <w:r>
-        <w:tab/>
-        <w:t xml:space="preserve">la selección de elementos del DOM y la manipulación de su contenido es correcto. También manipulaste correctamente clases y atributos con </w:t>
-      </w:r>
-      <w:proofErr w:type="spellStart"/>
-      <w:r>
-        <w:t>Dataset</w:t>
-      </w:r>
-      <w:proofErr w:type="spellEnd"/>
-      <w:r>
-        <w:t>.</w:t>
-      </w:r>
-    </w:p>
-    <w:p>
-      <w:r>
-        <w:t xml:space="preserve"> </w:t>
-      </w:r>
-    </w:p>
+        <w:t>Tomas</w:t>
+      </w:r>
+      <w:r>
+        <w:t>, excelente trabajo,</w:t>
+      </w:r>
+      <w:r>
+        <w:t xml:space="preserve"> el resultado es el solicitado.</w:t>
+      </w:r>
+    </w:p>
+    <w:p/>
+    <w:p>
+      <w:r>
+        <w:t xml:space="preserve">La aplicación En </w:t>
+      </w:r>
+      <w:proofErr w:type="spellStart"/>
+      <w:r>
+        <w:t>React</w:t>
+      </w:r>
+      <w:proofErr w:type="spellEnd"/>
+      <w:r>
+        <w:t xml:space="preserve"> Vite es tal cual se solicitó en enunciado.</w:t>
+      </w:r>
+    </w:p>
+    <w:p/>
     <w:p>
       <w:pPr>
         <w:rPr>
           <w:u w:val="single"/>
         </w:rPr>
       </w:pPr>
-      <w:proofErr w:type="spellStart"/>
-      <w:r>
-        <w:t>Buenisimo</w:t>
-      </w:r>
-      <w:proofErr w:type="spellEnd"/>
-      <w:r>
-        <w:t xml:space="preserve"> que aplicaste eventos con </w:t>
-      </w:r>
-      <w:proofErr w:type="spellStart"/>
-      <w:r>
-        <w:t>addEventListener</w:t>
-      </w:r>
-      <w:proofErr w:type="spellEnd"/>
-      <w:r>
-        <w:t xml:space="preserve">, correcta la aplicación </w:t>
-      </w:r>
-      <w:proofErr w:type="spellStart"/>
-      <w:r>
-        <w:t>Event</w:t>
-      </w:r>
-      <w:proofErr w:type="spellEnd"/>
-      <w:r>
-        <w:t xml:space="preserve"> </w:t>
-      </w:r>
-      <w:proofErr w:type="spellStart"/>
-      <w:r>
-        <w:t>Delegation</w:t>
-      </w:r>
-      <w:proofErr w:type="spellEnd"/>
-      <w:r>
-        <w:t>.</w:t>
-      </w:r>
-    </w:p>
-    <w:p/>
-    <w:p>
-      <w:r>
-        <w:t>Destaco que para evitar la repetición de código te manejaste correctamente con funciones con retorno y también de alto orden.</w:t>
-      </w:r>
-    </w:p>
-    <w:p/>
-    <w:p>
-      <w:r>
-        <w:t>Quiero destacar la prolijidad de tu código.</w:t>
+      <w:r>
+        <w:t xml:space="preserve">La estructura del proyecto esta ok, los componentes trabajan correctamente con </w:t>
+      </w:r>
+      <w:proofErr w:type="spellStart"/>
+      <w:r>
+        <w:t>props</w:t>
+      </w:r>
+      <w:proofErr w:type="spellEnd"/>
+      <w:r>
+        <w:t xml:space="preserve"> y el proyecto levanta la lista de contactos del array indicado.</w:t>
+      </w:r>
+    </w:p>
+    <w:p/>
+    <w:p>
+      <w:r>
+        <w:t xml:space="preserve">Quiero destacar la prolijidad de tu código y </w:t>
+      </w:r>
+      <w:r>
+        <w:t xml:space="preserve">el trabajo aplicado en </w:t>
+      </w:r>
+      <w:r>
+        <w:t xml:space="preserve">los estilos </w:t>
+      </w:r>
+      <w:r>
+        <w:t>personalizados, quedo genial.</w:t>
       </w:r>
     </w:p>
     <w:p/>
@@ -2241,7 +1817,7 @@
     <w:p/>
     <w:p>
       <w:r>
-        <w:t xml:space="preserve">Tu nota en el Desafío 08 es: </w:t>
+        <w:t xml:space="preserve">Tu nota en el Desafío 09 es: </w:t>
       </w:r>
       <w:r>
         <w:rPr>
@@ -2308,6 +1884,7 @@
         <w:rPr>
           <w:rFonts w:ascii="Segoe UI Emoji" w:hAnsi="Segoe UI Emoji" w:cs="Segoe UI Emoji"/>
         </w:rPr>
+        <w:lastRenderedPageBreak/>
         <w:t>🎉</w:t>
       </w:r>
       <w:r>
@@ -2371,7 +1948,6 @@
       </w:pPr>
       <w:proofErr w:type="spellStart"/>
       <w:r>
-        <w:lastRenderedPageBreak/>
         <w:t>Buenisimo</w:t>
       </w:r>
       <w:proofErr w:type="spellEnd"/>
@@ -2870,6 +2446,7 @@
         <w:ind w:left="708" w:hanging="708"/>
       </w:pPr>
       <w:r>
+        <w:lastRenderedPageBreak/>
         <w:t xml:space="preserve">La disposición de elementos en la </w:t>
       </w:r>
       <w:proofErr w:type="spellStart"/>
@@ -3130,7 +2707,6 @@
     <w:p/>
     <w:p>
       <w:r>
-        <w:lastRenderedPageBreak/>
         <w:t>Sofia, excelente trabajo</w:t>
       </w:r>
       <w:r>
@@ -3180,7 +2756,10 @@
     <w:p/>
     <w:p>
       <w:r>
-        <w:t>Excelente trabajo ¡</w:t>
+        <w:t>Muy buen</w:t>
+      </w:r>
+      <w:r>
+        <w:t xml:space="preserve"> trabajo ¡</w:t>
       </w:r>
     </w:p>
     <w:p/>
@@ -3277,144 +2856,64 @@
       </w:pPr>
     </w:p>
     <w:p>
-      <w:pPr>
-        <w:rPr>
-          <w:rFonts w:ascii="Segoe UI Emoji" w:hAnsi="Segoe UI Emoji" w:cs="Segoe UI Emoji"/>
-        </w:rPr>
-      </w:pPr>
-      <w:proofErr w:type="gramStart"/>
-      <w:r>
-        <w:rPr>
-          <w:rFonts w:ascii="Segoe UI Emoji" w:hAnsi="Segoe UI Emoji" w:cs="Segoe UI Emoji"/>
-        </w:rPr>
-        <w:t>🎉</w:t>
-      </w:r>
-      <w:r>
-        <w:t>¡</w:t>
-      </w:r>
-      <w:proofErr w:type="gramEnd"/>
-      <w:r>
-        <w:t>Felicitaciones por la entrega del Desafío 0</w:t>
-      </w:r>
-      <w:r>
-        <w:t>8</w:t>
-      </w:r>
-      <w:r>
-        <w:t xml:space="preserve">! </w:t>
-      </w:r>
-      <w:r>
-        <w:rPr>
-          <w:rFonts w:ascii="Segoe UI Emoji" w:hAnsi="Segoe UI Emoji" w:cs="Segoe UI Emoji"/>
-        </w:rPr>
-        <w:t>🎉</w:t>
-      </w:r>
-    </w:p>
-    <w:p/>
-    <w:p>
-      <w:r>
-        <w:t>Catalina, excelente trabajo, te felicito por el compromiso en realizar las entregas.</w:t>
-      </w:r>
-    </w:p>
-    <w:p/>
-    <w:p>
-      <w:r>
-        <w:t xml:space="preserve">Excelente </w:t>
-      </w:r>
-      <w:r>
-        <w:t xml:space="preserve">el resultado logrado, </w:t>
-      </w:r>
-      <w:r>
-        <w:tab/>
-        <w:t xml:space="preserve">la selección de elementos del DOM y la manipulación de su contenido es correcto. También manipulaste correctamente clases y atributos con </w:t>
-      </w:r>
-      <w:proofErr w:type="spellStart"/>
-      <w:r>
-        <w:t>Dataset</w:t>
-      </w:r>
-      <w:proofErr w:type="spellEnd"/>
-      <w:r>
-        <w:t>.</w:t>
-      </w:r>
-    </w:p>
-    <w:p>
-      <w:r>
-        <w:t xml:space="preserve"> </w:t>
-      </w:r>
-    </w:p>
+      <w:r>
+        <w:t>Catalina</w:t>
+      </w:r>
+      <w:r>
+        <w:t>, excelente trabajo</w:t>
+      </w:r>
+    </w:p>
+    <w:p/>
+    <w:p>
+      <w:r>
+        <w:t xml:space="preserve">La aplicación En </w:t>
+      </w:r>
+      <w:proofErr w:type="spellStart"/>
+      <w:r>
+        <w:t>React</w:t>
+      </w:r>
+      <w:proofErr w:type="spellEnd"/>
+      <w:r>
+        <w:t xml:space="preserve"> Vite es tal cual se solicitó en enunciado.</w:t>
+      </w:r>
+    </w:p>
+    <w:p/>
     <w:p>
       <w:pPr>
         <w:rPr>
           <w:u w:val="single"/>
         </w:rPr>
       </w:pPr>
-      <w:proofErr w:type="spellStart"/>
-      <w:r>
-        <w:t>Buenisimo</w:t>
-      </w:r>
-      <w:proofErr w:type="spellEnd"/>
-      <w:r>
-        <w:t xml:space="preserve"> que aplicaste eventos con </w:t>
-      </w:r>
-      <w:proofErr w:type="spellStart"/>
-      <w:r>
-        <w:t>addEventListener</w:t>
-      </w:r>
-      <w:proofErr w:type="spellEnd"/>
-      <w:r>
-        <w:t xml:space="preserve">, correcta la aplicación </w:t>
-      </w:r>
-      <w:proofErr w:type="spellStart"/>
-      <w:r>
-        <w:t>Event</w:t>
-      </w:r>
-      <w:proofErr w:type="spellEnd"/>
-      <w:r>
-        <w:t xml:space="preserve"> </w:t>
-      </w:r>
-      <w:proofErr w:type="spellStart"/>
-      <w:r>
-        <w:t>Delegation</w:t>
-      </w:r>
-      <w:proofErr w:type="spellEnd"/>
-      <w:r>
-        <w:t>.</w:t>
-      </w:r>
-    </w:p>
-    <w:p/>
-    <w:p>
-      <w:r>
-        <w:t>Destaco que p</w:t>
-      </w:r>
-      <w:r>
-        <w:t>ara evitar la repetición de código te manejaste correctamente con funciones con retorno y también de alto orden.</w:t>
-      </w:r>
-    </w:p>
-    <w:p/>
-    <w:p>
-      <w:r>
-        <w:t>Quiero destacar la prolijidad de tu código.</w:t>
-      </w:r>
-    </w:p>
-    <w:p/>
-    <w:p/>
-    <w:p>
-      <w:r>
-        <w:t>Excelente</w:t>
-      </w:r>
-      <w:r>
-        <w:t xml:space="preserve"> trabajo ¡</w:t>
-      </w:r>
-    </w:p>
-    <w:p/>
-    <w:p>
-      <w:r>
-        <w:t>Tu nota en el Desafío 0</w:t>
-      </w:r>
-      <w:r>
-        <w:t>8</w:t>
-      </w:r>
-      <w:r>
-        <w:t xml:space="preserve"> es: </w:t>
+      <w:r>
+        <w:lastRenderedPageBreak/>
+        <w:t xml:space="preserve">La estructura del proyecto esta ok, los componentes trabajan correctamente con </w:t>
+      </w:r>
+      <w:proofErr w:type="spellStart"/>
+      <w:r>
+        <w:t>props</w:t>
+      </w:r>
+      <w:proofErr w:type="spellEnd"/>
+      <w:r>
+        <w:t xml:space="preserve"> y el proyecto levanta la lista de contactos del array indicado.</w:t>
+      </w:r>
+    </w:p>
+    <w:p/>
+    <w:p>
+      <w:r>
+        <w:t>Quiero destacar la prolijidad de tu código y los estilos aplicados con Bootstrap quedaron genial.</w:t>
+      </w:r>
+    </w:p>
+    <w:p/>
+    <w:p/>
+    <w:p>
+      <w:r>
+        <w:t>Excelente trabajo ¡</w:t>
+      </w:r>
+    </w:p>
+    <w:p/>
+    <w:p>
+      <w:r>
+        <w:t xml:space="preserve">Tu nota en el Desafío 09 es: </w:t>
       </w:r>
       <w:r>
         <w:rPr>
@@ -3460,113 +2959,50 @@
       </w:pPr>
     </w:p>
     <w:p>
-      <w:pPr>
-        <w:rPr>
-          <w:rFonts w:ascii="Segoe UI Emoji" w:hAnsi="Segoe UI Emoji" w:cs="Segoe UI Emoji"/>
-        </w:rPr>
-      </w:pPr>
-      <w:proofErr w:type="gramStart"/>
-      <w:r>
-        <w:rPr>
-          <w:rFonts w:ascii="Segoe UI Emoji" w:hAnsi="Segoe UI Emoji" w:cs="Segoe UI Emoji"/>
-        </w:rPr>
-        <w:t>🎉</w:t>
-      </w:r>
-      <w:r>
-        <w:t>¡</w:t>
-      </w:r>
-      <w:proofErr w:type="gramEnd"/>
-      <w:r>
-        <w:t xml:space="preserve">Felicitaciones por la entrega del Desafío 08! </w:t>
-      </w:r>
-      <w:r>
-        <w:rPr>
-          <w:rFonts w:ascii="Segoe UI Emoji" w:hAnsi="Segoe UI Emoji" w:cs="Segoe UI Emoji"/>
-        </w:rPr>
-        <w:t>🎉</w:t>
-      </w:r>
-    </w:p>
-    <w:p/>
-    <w:p>
       <w:r>
         <w:t>Micaela</w:t>
       </w:r>
       <w:r>
-        <w:t>, excelente trabajo, te felicito por el compromiso en realizar las entregas.</w:t>
-      </w:r>
-    </w:p>
-    <w:p/>
-    <w:p>
-      <w:r>
-        <w:t xml:space="preserve">Excelente el resultado logrado, </w:t>
-      </w:r>
-      <w:r>
-        <w:tab/>
-        <w:t xml:space="preserve">la selección de elementos del DOM y la manipulación de su contenido es correcto. También manipulaste correctamente clases y atributos con </w:t>
-      </w:r>
-      <w:proofErr w:type="spellStart"/>
-      <w:r>
-        <w:t>Dataset</w:t>
-      </w:r>
-      <w:proofErr w:type="spellEnd"/>
-      <w:r>
-        <w:t>.</w:t>
-      </w:r>
-    </w:p>
-    <w:p>
-      <w:r>
-        <w:t xml:space="preserve"> </w:t>
-      </w:r>
-    </w:p>
+        <w:t>, excelente trabajo</w:t>
+      </w:r>
+    </w:p>
+    <w:p/>
+    <w:p>
+      <w:r>
+        <w:t xml:space="preserve">La aplicación En </w:t>
+      </w:r>
+      <w:proofErr w:type="spellStart"/>
+      <w:r>
+        <w:t>React</w:t>
+      </w:r>
+      <w:proofErr w:type="spellEnd"/>
+      <w:r>
+        <w:t xml:space="preserve"> Vite es tal cual se solicitó en enunciado.</w:t>
+      </w:r>
+    </w:p>
+    <w:p/>
     <w:p>
       <w:pPr>
         <w:rPr>
           <w:u w:val="single"/>
         </w:rPr>
       </w:pPr>
-      <w:proofErr w:type="spellStart"/>
-      <w:r>
-        <w:t>Buenisimo</w:t>
-      </w:r>
-      <w:proofErr w:type="spellEnd"/>
-      <w:r>
-        <w:t xml:space="preserve"> que aplicaste eventos con </w:t>
-      </w:r>
-      <w:proofErr w:type="spellStart"/>
-      <w:r>
-        <w:t>addEventListener</w:t>
-      </w:r>
-      <w:proofErr w:type="spellEnd"/>
-      <w:r>
-        <w:t xml:space="preserve">, correcta la aplicación </w:t>
-      </w:r>
-      <w:proofErr w:type="spellStart"/>
-      <w:r>
-        <w:t>Event</w:t>
-      </w:r>
-      <w:proofErr w:type="spellEnd"/>
-      <w:r>
-        <w:t xml:space="preserve"> </w:t>
-      </w:r>
-      <w:proofErr w:type="spellStart"/>
-      <w:r>
-        <w:t>Delegation</w:t>
-      </w:r>
-      <w:proofErr w:type="spellEnd"/>
-      <w:r>
-        <w:t>.</w:t>
-      </w:r>
-    </w:p>
-    <w:p/>
-    <w:p>
-      <w:r>
-        <w:t>Destaco que para evitar la repetición de código te manejaste correctamente con funciones con retorno y también de alto orden.</w:t>
-      </w:r>
-    </w:p>
-    <w:p/>
-    <w:p>
-      <w:r>
-        <w:t>Quiero destacar la prolijidad de tu código.</w:t>
+      <w:r>
+        <w:t xml:space="preserve">La estructura del proyecto esta ok, los componentes trabajan correctamente con </w:t>
+      </w:r>
+      <w:proofErr w:type="spellStart"/>
+      <w:r>
+        <w:t>props</w:t>
+      </w:r>
+      <w:proofErr w:type="spellEnd"/>
+      <w:r>
+        <w:t xml:space="preserve"> y el proyecto levanta la lista de contactos del array indicado.</w:t>
+      </w:r>
+    </w:p>
+    <w:p/>
+    <w:p>
+      <w:r>
+        <w:t>Quiero destacar la prolijidad de tu código y los estilos aplicados con Bootstrap quedaron genial.</w:t>
       </w:r>
     </w:p>
     <w:p/>
@@ -3579,7 +3015,7 @@
     <w:p/>
     <w:p>
       <w:r>
-        <w:t xml:space="preserve">Tu nota en el Desafío 08 es: </w:t>
+        <w:t xml:space="preserve">Tu nota en el Desafío 09 es: </w:t>
       </w:r>
       <w:r>
         <w:rPr>
@@ -3612,7 +3048,6 @@
           <w:b/>
           <w:bCs/>
         </w:rPr>
-        <w:lastRenderedPageBreak/>
         <w:t>Zabala Pons Gonzalo</w:t>
       </w:r>
     </w:p>
@@ -3880,7 +3315,6 @@
       </w:pPr>
       <w:proofErr w:type="spellStart"/>
       <w:r>
-        <w:lastRenderedPageBreak/>
         <w:t>Buenisimo</w:t>
       </w:r>
       <w:proofErr w:type="spellEnd"/>
@@ -3990,7 +3424,7 @@
       </w:r>
       <w:proofErr w:type="gramEnd"/>
       <w:r>
-        <w:t xml:space="preserve">Felicitaciones por la entrega del Desafío 08! </w:t>
+        <w:t xml:space="preserve">Felicitaciones por la entrega del Desafío 09! </w:t>
       </w:r>
       <w:r>
         <w:rPr>
@@ -4002,450 +3436,86 @@
     <w:p/>
     <w:p>
       <w:r>
-        <w:t xml:space="preserve">Adriano, </w:t>
+        <w:t>Adriano</w:t>
+      </w:r>
+      <w:r>
+        <w:t xml:space="preserve">, </w:t>
       </w:r>
       <w:r>
         <w:t>muy buen</w:t>
       </w:r>
       <w:r>
-        <w:t xml:space="preserve"> trabajo, te felicito por el compromiso en realizar las entregas.</w:t>
-      </w:r>
-    </w:p>
-    <w:p/>
-    <w:p>
-      <w:r>
-        <w:t>Tuviste algunos errores de sintaxis y faltaron algunas evaluaciones lógicas</w:t>
-      </w:r>
-      <w:r>
-        <w:t xml:space="preserve">, </w:t>
-      </w:r>
-      <w:r>
-        <w:t xml:space="preserve">luego </w:t>
-      </w:r>
-      <w:r>
-        <w:t xml:space="preserve">la selección de elementos del DOM y la manipulación de su contenido es </w:t>
-      </w:r>
-      <w:proofErr w:type="gramStart"/>
-      <w:r>
-        <w:t>correcto</w:t>
-      </w:r>
-      <w:proofErr w:type="gramEnd"/>
-      <w:r>
-        <w:t xml:space="preserve">. También manipulaste correctamente clases y atributos con </w:t>
-      </w:r>
-      <w:proofErr w:type="spellStart"/>
-      <w:r>
-        <w:t>Dataset</w:t>
+        <w:t xml:space="preserve"> trabajo,</w:t>
+      </w:r>
+    </w:p>
+    <w:p/>
+    <w:p>
+      <w:r>
+        <w:t xml:space="preserve">La aplicación En </w:t>
+      </w:r>
+      <w:proofErr w:type="spellStart"/>
+      <w:r>
+        <w:t>React</w:t>
+      </w:r>
+      <w:proofErr w:type="spellEnd"/>
+      <w:r>
+        <w:t xml:space="preserve"> Vite es tal cual se solicitó en enunciado.</w:t>
+      </w:r>
+    </w:p>
+    <w:p/>
+    <w:p>
+      <w:pPr>
+        <w:rPr>
+          <w:u w:val="single"/>
+        </w:rPr>
+      </w:pPr>
+      <w:r>
+        <w:t xml:space="preserve">La estructura del proyecto esta ok, los componentes trabajan correctamente con </w:t>
+      </w:r>
+      <w:proofErr w:type="spellStart"/>
+      <w:r>
+        <w:t>props</w:t>
+      </w:r>
+      <w:proofErr w:type="spellEnd"/>
+      <w:r>
+        <w:t xml:space="preserve"> y el proyecto levanta la lista de contactos del array indicado.</w:t>
+      </w:r>
+    </w:p>
+    <w:p/>
+    <w:p>
+      <w:r>
+        <w:t>Quiero destacar la prolijidad de tu código.</w:t>
+      </w:r>
+      <w:r>
+        <w:t xml:space="preserve"> Me hubiera gustado que le apliques algunos estilos para el diseño de las </w:t>
+      </w:r>
+      <w:proofErr w:type="spellStart"/>
+      <w:r>
+        <w:t>cards</w:t>
       </w:r>
       <w:proofErr w:type="spellEnd"/>
       <w:r>
         <w:t>.</w:t>
       </w:r>
     </w:p>
-    <w:p>
-      <w:r>
-        <w:t xml:space="preserve"> </w:t>
-      </w:r>
-    </w:p>
-    <w:p>
-      <w:pPr>
-        <w:rPr>
-          <w:u w:val="single"/>
-        </w:rPr>
-      </w:pPr>
-      <w:proofErr w:type="spellStart"/>
-      <w:r>
-        <w:t>Buenisimo</w:t>
-      </w:r>
-      <w:proofErr w:type="spellEnd"/>
-      <w:r>
-        <w:t xml:space="preserve"> que aplicaste eventos con </w:t>
-      </w:r>
-      <w:proofErr w:type="spellStart"/>
-      <w:r>
-        <w:t>addEventListener</w:t>
-      </w:r>
-      <w:proofErr w:type="spellEnd"/>
-      <w:r>
-        <w:t xml:space="preserve">, correcta la aplicación </w:t>
-      </w:r>
-      <w:proofErr w:type="spellStart"/>
-      <w:r>
-        <w:t>Event</w:t>
-      </w:r>
-      <w:proofErr w:type="spellEnd"/>
-      <w:r>
-        <w:t xml:space="preserve"> </w:t>
-      </w:r>
-      <w:proofErr w:type="spellStart"/>
-      <w:r>
-        <w:t>Delegation</w:t>
-      </w:r>
-      <w:proofErr w:type="spellEnd"/>
-      <w:r>
-        <w:t>.</w:t>
-      </w:r>
-    </w:p>
-    <w:p/>
-    <w:p>
-      <w:r>
-        <w:t>Quiero destacar la prolijidad de tu código.</w:t>
-      </w:r>
-    </w:p>
-    <w:p/>
-    <w:p/>
-    <w:p>
-      <w:r>
-        <w:t>Observaciones a tu trabajo son:</w:t>
-      </w:r>
-    </w:p>
-    <w:p/>
-    <w:p>
-      <w:r>
-        <w:lastRenderedPageBreak/>
-        <w:t>Ejercicio nro. 8:</w:t>
-      </w:r>
-    </w:p>
-    <w:p>
-      <w:pPr>
-        <w:pStyle w:val="Prrafodelista"/>
-        <w:numPr>
-          <w:ilvl w:val="0"/>
-          <w:numId w:val="4"/>
-        </w:numPr>
-      </w:pPr>
-      <w:r>
-        <w:t>Campo Nombre</w:t>
-      </w:r>
-    </w:p>
-    <w:p>
-      <w:pPr>
-        <w:pStyle w:val="Prrafodelista"/>
-        <w:numPr>
-          <w:ilvl w:val="1"/>
-          <w:numId w:val="4"/>
-        </w:numPr>
-      </w:pPr>
-      <w:r>
-        <w:t xml:space="preserve">reemplazar propiedad </w:t>
-      </w:r>
-      <w:proofErr w:type="spellStart"/>
-      <w:r>
-        <w:t>ariaValueMax</w:t>
-      </w:r>
-      <w:proofErr w:type="spellEnd"/>
-      <w:r>
-        <w:t xml:space="preserve"> por </w:t>
-      </w:r>
-      <w:proofErr w:type="spellStart"/>
-      <w:r>
-        <w:t>value</w:t>
-      </w:r>
-      <w:proofErr w:type="spellEnd"/>
-      <w:r>
-        <w:t xml:space="preserve"> en la línea 56</w:t>
-      </w:r>
-    </w:p>
-    <w:p>
-      <w:pPr>
-        <w:pStyle w:val="Prrafodelista"/>
-        <w:numPr>
-          <w:ilvl w:val="1"/>
-          <w:numId w:val="4"/>
-        </w:numPr>
-      </w:pPr>
-      <w:r>
-        <w:t xml:space="preserve">Falta evaluación de caso nombre </w:t>
-      </w:r>
-      <w:proofErr w:type="spellStart"/>
-      <w:r>
-        <w:t>vacio</w:t>
-      </w:r>
-      <w:proofErr w:type="spellEnd"/>
-      <w:r>
-        <w:t xml:space="preserve"> con un </w:t>
-      </w:r>
-      <w:proofErr w:type="spellStart"/>
-      <w:proofErr w:type="gramStart"/>
-      <w:r>
-        <w:t>if</w:t>
-      </w:r>
-      <w:proofErr w:type="spellEnd"/>
-      <w:r>
-        <w:t>(</w:t>
-      </w:r>
-      <w:proofErr w:type="gramEnd"/>
-      <w:r>
-        <w:t>valor ===""){} al igual que hiciste en el campo email.</w:t>
-      </w:r>
-    </w:p>
-    <w:p>
-      <w:pPr>
-        <w:pStyle w:val="Prrafodelista"/>
-        <w:numPr>
-          <w:ilvl w:val="1"/>
-          <w:numId w:val="4"/>
-        </w:numPr>
-      </w:pPr>
-      <w:r>
-        <w:t>error de sintaxis en evaluación longitud valor nombre (</w:t>
-      </w:r>
-      <w:proofErr w:type="spellStart"/>
-      <w:r>
-        <w:t>length</w:t>
-      </w:r>
-      <w:proofErr w:type="spellEnd"/>
-      <w:r>
-        <w:t>) en la linea64:</w:t>
-      </w:r>
-    </w:p>
-    <w:p>
-      <w:pPr>
-        <w:pStyle w:val="Prrafodelista"/>
-        <w:numPr>
-          <w:ilvl w:val="2"/>
-          <w:numId w:val="4"/>
-        </w:numPr>
-      </w:pPr>
-      <w:proofErr w:type="spellStart"/>
-      <w:r>
-        <w:t>if</w:t>
-      </w:r>
-      <w:proofErr w:type="spellEnd"/>
-      <w:r>
-        <w:t>(</w:t>
-      </w:r>
-      <w:proofErr w:type="spellStart"/>
-      <w:proofErr w:type="gramStart"/>
-      <w:r>
-        <w:t>valor.length</w:t>
-      </w:r>
-      <w:proofErr w:type="spellEnd"/>
-      <w:proofErr w:type="gramEnd"/>
-      <w:r>
-        <w:t>&lt;3)</w:t>
-      </w:r>
-    </w:p>
-    <w:p>
-      <w:pPr>
-        <w:pStyle w:val="Prrafodelista"/>
-        <w:numPr>
-          <w:ilvl w:val="1"/>
-          <w:numId w:val="4"/>
-        </w:numPr>
-      </w:pPr>
-      <w:r>
-        <w:t xml:space="preserve">Falto </w:t>
-      </w:r>
-      <w:proofErr w:type="gramStart"/>
-      <w:r>
-        <w:t>".</w:t>
-      </w:r>
-      <w:proofErr w:type="spellStart"/>
-      <w:r>
-        <w:t>add</w:t>
-      </w:r>
-      <w:proofErr w:type="spellEnd"/>
-      <w:proofErr w:type="gramEnd"/>
-      <w:r>
-        <w:t xml:space="preserve">" cuando </w:t>
-      </w:r>
-      <w:proofErr w:type="spellStart"/>
-      <w:r>
-        <w:t>queres</w:t>
-      </w:r>
-      <w:proofErr w:type="spellEnd"/>
-      <w:r>
-        <w:t xml:space="preserve"> agregar la clase "error" en la línea 65:</w:t>
-      </w:r>
-    </w:p>
-    <w:p>
-      <w:pPr>
-        <w:pStyle w:val="Prrafodelista"/>
-        <w:numPr>
-          <w:ilvl w:val="2"/>
-          <w:numId w:val="4"/>
-        </w:numPr>
-      </w:pPr>
-      <w:proofErr w:type="spellStart"/>
-      <w:r>
-        <w:t>nombre.classList.add</w:t>
-      </w:r>
-      <w:proofErr w:type="spellEnd"/>
-      <w:r>
-        <w:t>("error");</w:t>
-      </w:r>
-    </w:p>
-    <w:p/>
-    <w:p/>
-    <w:p>
-      <w:pPr>
-        <w:pStyle w:val="Prrafodelista"/>
-        <w:numPr>
-          <w:ilvl w:val="0"/>
-          <w:numId w:val="4"/>
-        </w:numPr>
-      </w:pPr>
-      <w:r>
-        <w:t>Campo Email</w:t>
-      </w:r>
-    </w:p>
-    <w:p>
-      <w:pPr>
-        <w:pStyle w:val="Prrafodelista"/>
-        <w:numPr>
-          <w:ilvl w:val="1"/>
-          <w:numId w:val="4"/>
-        </w:numPr>
-      </w:pPr>
-      <w:r>
-        <w:t xml:space="preserve">reemplazar propiedad </w:t>
-      </w:r>
-      <w:proofErr w:type="spellStart"/>
-      <w:r>
-        <w:t>ariaValueMax</w:t>
-      </w:r>
-      <w:proofErr w:type="spellEnd"/>
-      <w:r>
-        <w:t xml:space="preserve"> por </w:t>
-      </w:r>
-      <w:proofErr w:type="spellStart"/>
-      <w:r>
-        <w:t>value</w:t>
-      </w:r>
-      <w:proofErr w:type="spellEnd"/>
-    </w:p>
-    <w:p/>
-    <w:p/>
-    <w:p>
-      <w:pPr>
-        <w:pStyle w:val="Prrafodelista"/>
-        <w:numPr>
-          <w:ilvl w:val="0"/>
-          <w:numId w:val="7"/>
-        </w:numPr>
-      </w:pPr>
-      <w:r>
-        <w:t xml:space="preserve">Campo </w:t>
-      </w:r>
-      <w:proofErr w:type="spellStart"/>
-      <w:r>
-        <w:t>Password</w:t>
-      </w:r>
-      <w:proofErr w:type="spellEnd"/>
-    </w:p>
-    <w:p>
-      <w:pPr>
-        <w:pStyle w:val="Prrafodelista"/>
-        <w:numPr>
-          <w:ilvl w:val="1"/>
-          <w:numId w:val="4"/>
-        </w:numPr>
-      </w:pPr>
-      <w:r>
-        <w:t>error de sintaxis en evaluación longitud valor nombre (</w:t>
-      </w:r>
-      <w:proofErr w:type="spellStart"/>
-      <w:r>
-        <w:t>length</w:t>
-      </w:r>
-      <w:proofErr w:type="spellEnd"/>
-      <w:r>
-        <w:t>)</w:t>
-      </w:r>
-    </w:p>
-    <w:p/>
-    <w:p>
-      <w:r>
-        <w:t>Ejercicio nro. 9:</w:t>
-      </w:r>
-    </w:p>
-    <w:p/>
-    <w:p>
-      <w:pPr>
-        <w:pStyle w:val="Prrafodelista"/>
-        <w:numPr>
-          <w:ilvl w:val="0"/>
-          <w:numId w:val="7"/>
-        </w:numPr>
-      </w:pPr>
-      <w:r>
-        <w:t xml:space="preserve">El botón para eliminar un contacto no está funcionando porque no estas obteniendo el valor id por un error de sintaxis en la </w:t>
-      </w:r>
-      <w:proofErr w:type="spellStart"/>
-      <w:r>
-        <w:t>linea</w:t>
-      </w:r>
-      <w:proofErr w:type="spellEnd"/>
-      <w:r>
-        <w:t xml:space="preserve"> 122:</w:t>
-      </w:r>
-    </w:p>
-    <w:p>
-      <w:pPr>
-        <w:pStyle w:val="Prrafodelista"/>
-        <w:numPr>
-          <w:ilvl w:val="1"/>
-          <w:numId w:val="4"/>
-        </w:numPr>
-      </w:pPr>
-      <w:proofErr w:type="spellStart"/>
-      <w:r>
-        <w:t>const</w:t>
-      </w:r>
-      <w:proofErr w:type="spellEnd"/>
-      <w:r>
-        <w:t xml:space="preserve"> id= </w:t>
-      </w:r>
-      <w:proofErr w:type="spellStart"/>
-      <w:r>
-        <w:t>Number</w:t>
-      </w:r>
-      <w:proofErr w:type="spellEnd"/>
-      <w:r>
-        <w:t>(</w:t>
-      </w:r>
-      <w:proofErr w:type="spellStart"/>
-      <w:r>
-        <w:t>botonEliminar.dataset.id</w:t>
-      </w:r>
-      <w:proofErr w:type="spellEnd"/>
-      <w:r>
-        <w:t>)</w:t>
-      </w:r>
-    </w:p>
-    <w:p/>
-    <w:p>
-      <w:r>
-        <w:tab/>
-      </w:r>
-    </w:p>
-    <w:p/>
-    <w:p>
-      <w:r>
-        <w:tab/>
-      </w:r>
-    </w:p>
-    <w:p/>
-    <w:p>
-      <w:r>
-        <w:t xml:space="preserve">Todo lo demás esta perfecto, muy buen </w:t>
-      </w:r>
-      <w:r>
-        <w:t>trabajo ¡</w:t>
-      </w:r>
-    </w:p>
-    <w:p/>
-    <w:p>
-      <w:r>
-        <w:t xml:space="preserve">Tu nota en el Desafío 08 es: </w:t>
-      </w:r>
-      <w:r>
-        <w:rPr>
-          <w:b/>
-          <w:bCs/>
-        </w:rPr>
-        <w:t>9</w:t>
+    <w:p/>
+    <w:p/>
+    <w:p>
+      <w:r>
+        <w:t>Muy buen trabajo ¡</w:t>
+      </w:r>
+    </w:p>
+    <w:p/>
+    <w:p>
+      <w:r>
+        <w:t xml:space="preserve">Tu nota en el Desafío 09 es: </w:t>
+      </w:r>
+      <w:r>
+        <w:rPr>
+          <w:b/>
+          <w:bCs/>
+        </w:rPr>
+        <w:t>10</w:t>
       </w:r>
     </w:p>
     <w:p/>

</xml_diff>

<commit_message>
Correccion 09 - Terminado OK Agustin Albarracin
</commit_message>
<xml_diff>
--- a/Practicos/Notas y Devoluciones 09.docx
+++ b/Practicos/Notas y Devoluciones 09.docx
@@ -472,7 +472,7 @@
       </w:r>
       <w:proofErr w:type="gramEnd"/>
       <w:r>
-        <w:t xml:space="preserve">Felicitaciones por la entrega del Desafío 08! </w:t>
+        <w:t xml:space="preserve">Felicitaciones por la entrega del Desafío 09! </w:t>
       </w:r>
       <w:r>
         <w:rPr>
@@ -489,94 +489,60 @@
       </w:r>
       <w:proofErr w:type="spellEnd"/>
       <w:r>
-        <w:t>, excelente trabajo, te felicito por el compromiso en realizar las entregas.</w:t>
-      </w:r>
-    </w:p>
-    <w:p/>
-    <w:p>
-      <w:r>
-        <w:t xml:space="preserve">Excelente el resultado logrado, </w:t>
-      </w:r>
-      <w:r>
-        <w:tab/>
-        <w:t xml:space="preserve">la selección de elementos del DOM y la manipulación de su contenido es correcto. También manipulaste correctamente clases y atributos con </w:t>
-      </w:r>
-      <w:proofErr w:type="spellStart"/>
-      <w:r>
-        <w:t>Dataset</w:t>
-      </w:r>
-      <w:proofErr w:type="spellEnd"/>
-      <w:r>
-        <w:t>.</w:t>
-      </w:r>
-    </w:p>
-    <w:p>
-      <w:r>
-        <w:t xml:space="preserve"> </w:t>
-      </w:r>
-    </w:p>
+        <w:t>, excelente trabajo,</w:t>
+      </w:r>
+    </w:p>
+    <w:p/>
+    <w:p>
+      <w:r>
+        <w:t xml:space="preserve">La aplicación En </w:t>
+      </w:r>
+      <w:proofErr w:type="spellStart"/>
+      <w:r>
+        <w:t>React</w:t>
+      </w:r>
+      <w:proofErr w:type="spellEnd"/>
+      <w:r>
+        <w:t xml:space="preserve"> Vite es tal cual se solicitó en enunciado.</w:t>
+      </w:r>
+    </w:p>
+    <w:p/>
     <w:p>
       <w:pPr>
         <w:rPr>
           <w:u w:val="single"/>
         </w:rPr>
       </w:pPr>
-      <w:proofErr w:type="spellStart"/>
-      <w:r>
-        <w:t>Buenisimo</w:t>
-      </w:r>
-      <w:proofErr w:type="spellEnd"/>
-      <w:r>
-        <w:t xml:space="preserve"> que aplicaste eventos con </w:t>
-      </w:r>
-      <w:proofErr w:type="spellStart"/>
-      <w:r>
-        <w:t>addEventListener</w:t>
-      </w:r>
-      <w:proofErr w:type="spellEnd"/>
-      <w:r>
-        <w:t xml:space="preserve">, correcta la aplicación </w:t>
-      </w:r>
-      <w:proofErr w:type="spellStart"/>
-      <w:r>
-        <w:t>Event</w:t>
-      </w:r>
-      <w:proofErr w:type="spellEnd"/>
-      <w:r>
-        <w:t xml:space="preserve"> </w:t>
-      </w:r>
-      <w:proofErr w:type="spellStart"/>
-      <w:r>
-        <w:t>Delegation</w:t>
-      </w:r>
-      <w:proofErr w:type="spellEnd"/>
-      <w:r>
-        <w:t>.</w:t>
-      </w:r>
-    </w:p>
-    <w:p/>
-    <w:p>
-      <w:r>
-        <w:t>Destaco que para evitar la repetición de código te manejaste correctamente con funciones con retorno y también de alto orden.</w:t>
-      </w:r>
-    </w:p>
-    <w:p/>
-    <w:p>
-      <w:r>
-        <w:t>Quiero destacar la prolijidad de tu código.</w:t>
-      </w:r>
-    </w:p>
-    <w:p/>
-    <w:p/>
-    <w:p>
-      <w:r>
+      <w:r>
+        <w:t xml:space="preserve">La estructura del proyecto esta ok, los componentes trabajan correctamente con </w:t>
+      </w:r>
+      <w:proofErr w:type="spellStart"/>
+      <w:r>
+        <w:t>props</w:t>
+      </w:r>
+      <w:proofErr w:type="spellEnd"/>
+      <w:r>
+        <w:t xml:space="preserve"> y el proyecto levanta la lista de contactos del array indicado.</w:t>
+      </w:r>
+    </w:p>
+    <w:p/>
+    <w:p>
+      <w:r>
+        <w:t>Quiero destacar la prolijidad de tu código y los estilos aplicados con Bootstrap quedaron genial.</w:t>
+      </w:r>
+    </w:p>
+    <w:p/>
+    <w:p/>
+    <w:p>
+      <w:r>
+        <w:lastRenderedPageBreak/>
         <w:t>Excelente trabajo ¡</w:t>
       </w:r>
     </w:p>
     <w:p/>
     <w:p>
       <w:r>
-        <w:t xml:space="preserve">Tu nota en el Desafío 08 es: </w:t>
+        <w:t xml:space="preserve">Tu nota en el Desafío 09 es: </w:t>
       </w:r>
       <w:r>
         <w:rPr>
@@ -799,38 +765,38 @@
           <w:b/>
           <w:bCs/>
         </w:rPr>
+        <w:t xml:space="preserve">Figueroa Maidana Belen </w:t>
+      </w:r>
+      <w:r>
+        <w:rPr>
+          <w:rFonts w:ascii="Segoe UI Emoji" w:hAnsi="Segoe UI Emoji" w:cs="Segoe UI Emoji"/>
+          <w:b/>
+          <w:bCs/>
+        </w:rPr>
+        <w:t>Agostina</w:t>
+      </w:r>
+    </w:p>
+    <w:p>
+      <w:pPr>
+        <w:rPr>
+          <w:rFonts w:ascii="Segoe UI Emoji" w:hAnsi="Segoe UI Emoji" w:cs="Segoe UI Emoji"/>
+          <w:b/>
+          <w:bCs/>
+        </w:rPr>
+      </w:pPr>
+    </w:p>
+    <w:p>
+      <w:pPr>
+        <w:rPr>
+          <w:rFonts w:ascii="Segoe UI Emoji" w:hAnsi="Segoe UI Emoji" w:cs="Segoe UI Emoji"/>
+        </w:rPr>
+      </w:pPr>
+      <w:proofErr w:type="gramStart"/>
+      <w:r>
+        <w:rPr>
+          <w:rFonts w:ascii="Segoe UI Emoji" w:hAnsi="Segoe UI Emoji" w:cs="Segoe UI Emoji"/>
+        </w:rPr>
         <w:lastRenderedPageBreak/>
-        <w:t xml:space="preserve">Figueroa Maidana Belen </w:t>
-      </w:r>
-      <w:r>
-        <w:rPr>
-          <w:rFonts w:ascii="Segoe UI Emoji" w:hAnsi="Segoe UI Emoji" w:cs="Segoe UI Emoji"/>
-          <w:b/>
-          <w:bCs/>
-        </w:rPr>
-        <w:t>Agostina</w:t>
-      </w:r>
-    </w:p>
-    <w:p>
-      <w:pPr>
-        <w:rPr>
-          <w:rFonts w:ascii="Segoe UI Emoji" w:hAnsi="Segoe UI Emoji" w:cs="Segoe UI Emoji"/>
-          <w:b/>
-          <w:bCs/>
-        </w:rPr>
-      </w:pPr>
-    </w:p>
-    <w:p>
-      <w:pPr>
-        <w:rPr>
-          <w:rFonts w:ascii="Segoe UI Emoji" w:hAnsi="Segoe UI Emoji" w:cs="Segoe UI Emoji"/>
-        </w:rPr>
-      </w:pPr>
-      <w:proofErr w:type="gramStart"/>
-      <w:r>
-        <w:rPr>
-          <w:rFonts w:ascii="Segoe UI Emoji" w:hAnsi="Segoe UI Emoji" w:cs="Segoe UI Emoji"/>
-        </w:rPr>
         <w:t>🎉</w:t>
       </w:r>
       <w:r>
@@ -1192,10 +1158,7 @@
     <w:p/>
     <w:p>
       <w:r>
-        <w:t>Carlos</w:t>
-      </w:r>
-      <w:r>
-        <w:t>, excelente trabajo, el resultado es el solicitado.</w:t>
+        <w:t>Carlos, excelente trabajo, el resultado es el solicitado.</w:t>
       </w:r>
     </w:p>
     <w:p/>
@@ -1247,7 +1210,6 @@
     <w:p/>
     <w:p>
       <w:r>
-        <w:lastRenderedPageBreak/>
         <w:t xml:space="preserve">Tu nota en el Desafío 09 es: </w:t>
       </w:r>
       <w:r>
@@ -1333,10 +1295,7 @@
     <w:p/>
     <w:p>
       <w:r>
-        <w:t>Gianluca</w:t>
-      </w:r>
-      <w:r>
-        <w:t>, excelente trabajo,</w:t>
+        <w:t>Gianluca, excelente trabajo,</w:t>
       </w:r>
     </w:p>
     <w:p/>
@@ -1662,13 +1621,13 @@
     <w:p/>
     <w:p>
       <w:r>
+        <w:t>Excelente trabajo ¡</w:t>
+      </w:r>
+    </w:p>
+    <w:p/>
+    <w:p>
+      <w:r>
         <w:lastRenderedPageBreak/>
-        <w:t>Excelente trabajo ¡</w:t>
-      </w:r>
-    </w:p>
-    <w:p/>
-    <w:p>
-      <w:r>
         <w:t xml:space="preserve">Tu nota en el Desafío 09 es: </w:t>
       </w:r>
       <w:r>
@@ -1750,13 +1709,7 @@
     <w:p/>
     <w:p>
       <w:r>
-        <w:t>Tomas</w:t>
-      </w:r>
-      <w:r>
-        <w:t>, excelente trabajo,</w:t>
-      </w:r>
-      <w:r>
-        <w:t xml:space="preserve"> el resultado es el solicitado.</w:t>
+        <w:t>Tomas, excelente trabajo, el resultado es el solicitado.</w:t>
       </w:r>
     </w:p>
     <w:p/>
@@ -1801,10 +1754,7 @@
         <w:t xml:space="preserve">el trabajo aplicado en </w:t>
       </w:r>
       <w:r>
-        <w:t xml:space="preserve">los estilos </w:t>
-      </w:r>
-      <w:r>
-        <w:t>personalizados, quedo genial.</w:t>
+        <w:t>los estilos personalizados, quedo genial.</w:t>
       </w:r>
     </w:p>
     <w:p/>
@@ -1884,26 +1834,26 @@
         <w:rPr>
           <w:rFonts w:ascii="Segoe UI Emoji" w:hAnsi="Segoe UI Emoji" w:cs="Segoe UI Emoji"/>
         </w:rPr>
+        <w:t>🎉</w:t>
+      </w:r>
+      <w:r>
+        <w:t>¡</w:t>
+      </w:r>
+      <w:proofErr w:type="gramEnd"/>
+      <w:r>
+        <w:t xml:space="preserve">Felicitaciones por la entrega del Desafío 08! </w:t>
+      </w:r>
+      <w:r>
+        <w:rPr>
+          <w:rFonts w:ascii="Segoe UI Emoji" w:hAnsi="Segoe UI Emoji" w:cs="Segoe UI Emoji"/>
+        </w:rPr>
+        <w:t>🎉</w:t>
+      </w:r>
+    </w:p>
+    <w:p/>
+    <w:p>
+      <w:r>
         <w:lastRenderedPageBreak/>
-        <w:t>🎉</w:t>
-      </w:r>
-      <w:r>
-        <w:t>¡</w:t>
-      </w:r>
-      <w:proofErr w:type="gramEnd"/>
-      <w:r>
-        <w:t xml:space="preserve">Felicitaciones por la entrega del Desafío 08! </w:t>
-      </w:r>
-      <w:r>
-        <w:rPr>
-          <w:rFonts w:ascii="Segoe UI Emoji" w:hAnsi="Segoe UI Emoji" w:cs="Segoe UI Emoji"/>
-        </w:rPr>
-        <w:t>🎉</w:t>
-      </w:r>
-    </w:p>
-    <w:p/>
-    <w:p>
-      <w:r>
         <w:t>Ariana</w:t>
       </w:r>
       <w:r>
@@ -2446,28 +2396,28 @@
         <w:ind w:left="708" w:hanging="708"/>
       </w:pPr>
       <w:r>
+        <w:t xml:space="preserve">La disposición de elementos en la </w:t>
+      </w:r>
+      <w:proofErr w:type="spellStart"/>
+      <w:r>
+        <w:t>landing</w:t>
+      </w:r>
+      <w:proofErr w:type="spellEnd"/>
+      <w:r>
+        <w:t xml:space="preserve"> page quedo tal cual lo solicitado con la herramienta Flex.</w:t>
+      </w:r>
+    </w:p>
+    <w:p>
+      <w:pPr>
+        <w:ind w:left="708" w:hanging="708"/>
+      </w:pPr>
+    </w:p>
+    <w:p>
+      <w:pPr>
+        <w:ind w:left="708" w:hanging="708"/>
+      </w:pPr>
+      <w:r>
         <w:lastRenderedPageBreak/>
-        <w:t xml:space="preserve">La disposición de elementos en la </w:t>
-      </w:r>
-      <w:proofErr w:type="spellStart"/>
-      <w:r>
-        <w:t>landing</w:t>
-      </w:r>
-      <w:proofErr w:type="spellEnd"/>
-      <w:r>
-        <w:t xml:space="preserve"> page quedo tal cual lo solicitado con la herramienta Flex.</w:t>
-      </w:r>
-    </w:p>
-    <w:p>
-      <w:pPr>
-        <w:ind w:left="708" w:hanging="708"/>
-      </w:pPr>
-    </w:p>
-    <w:p>
-      <w:pPr>
-        <w:ind w:left="708" w:hanging="708"/>
-      </w:pPr>
-      <w:r>
         <w:t>Correctamente creadas la tabla y recurso de video. Los estilos tal cual los solicitados en imágenes de referencia.</w:t>
       </w:r>
     </w:p>
@@ -2857,10 +2807,7 @@
     </w:p>
     <w:p>
       <w:r>
-        <w:t>Catalina</w:t>
-      </w:r>
-      <w:r>
-        <w:t>, excelente trabajo</w:t>
+        <w:t>Catalina, excelente trabajo</w:t>
       </w:r>
     </w:p>
     <w:p/>
@@ -2885,21 +2832,21 @@
         </w:rPr>
       </w:pPr>
       <w:r>
+        <w:t xml:space="preserve">La estructura del proyecto esta ok, los componentes trabajan correctamente con </w:t>
+      </w:r>
+      <w:proofErr w:type="spellStart"/>
+      <w:r>
+        <w:t>props</w:t>
+      </w:r>
+      <w:proofErr w:type="spellEnd"/>
+      <w:r>
+        <w:t xml:space="preserve"> y el proyecto levanta la lista de contactos del array indicado.</w:t>
+      </w:r>
+    </w:p>
+    <w:p/>
+    <w:p>
+      <w:r>
         <w:lastRenderedPageBreak/>
-        <w:t xml:space="preserve">La estructura del proyecto esta ok, los componentes trabajan correctamente con </w:t>
-      </w:r>
-      <w:proofErr w:type="spellStart"/>
-      <w:r>
-        <w:t>props</w:t>
-      </w:r>
-      <w:proofErr w:type="spellEnd"/>
-      <w:r>
-        <w:t xml:space="preserve"> y el proyecto levanta la lista de contactos del array indicado.</w:t>
-      </w:r>
-    </w:p>
-    <w:p/>
-    <w:p>
-      <w:r>
         <w:t>Quiero destacar la prolijidad de tu código y los estilos aplicados con Bootstrap quedaron genial.</w:t>
       </w:r>
     </w:p>
@@ -2960,10 +2907,7 @@
     </w:p>
     <w:p>
       <w:r>
-        <w:t>Micaela</w:t>
-      </w:r>
-      <w:r>
-        <w:t>, excelente trabajo</w:t>
+        <w:t>Micaela, excelente trabajo</w:t>
       </w:r>
     </w:p>
     <w:p/>
@@ -3090,6 +3034,7 @@
     <w:p/>
     <w:p>
       <w:r>
+        <w:lastRenderedPageBreak/>
         <w:t>Gonzalo, el trabajo realizado es excelente. Destaco la prolijidad del documento ¡</w:t>
       </w:r>
     </w:p>
@@ -3355,6 +3300,7 @@
     <w:p/>
     <w:p>
       <w:r>
+        <w:lastRenderedPageBreak/>
         <w:t>Quiero destacar la prolijidad de tu código.</w:t>
       </w:r>
     </w:p>
@@ -3484,10 +3430,7 @@
     <w:p/>
     <w:p>
       <w:r>
-        <w:t>Quiero destacar la prolijidad de tu código.</w:t>
-      </w:r>
-      <w:r>
-        <w:t xml:space="preserve"> Me hubiera gustado que le apliques algunos estilos para el diseño de las </w:t>
+        <w:t xml:space="preserve">Quiero destacar la prolijidad de tu código. Me hubiera gustado que le apliques algunos estilos para el diseño de las </w:t>
       </w:r>
       <w:proofErr w:type="spellStart"/>
       <w:r>

</xml_diff>